<commit_message>
Add perceived-load/recovery columns for all microcycle days
Technical-tactical days had no session internal load in the data, so add real
daily markers available for every day: perceived physical fatigue (0-10) and
Total Quality Recovery (TQR, 6-20), computed from the training diary (group
means, anonymized). HIIT-specific internal load (%HRmax, TRIMP, sRPE, sRPE)
stays in its own columns; the legend distinguishes session internal load
(HIIT only) from perceived load/recovery (all days). Physical fatigue rises
4.7->7.6 and TQR recovery falls 13.5->9.0 across the week.

Co-Authored-By: Claude Opus 4.8 <noreply@anthropic.com>
Claude-Session: https://claude.ai/code/session_01P7yGiDeoGDyjWvPWQVsUrj
</commit_message>
<xml_diff>
--- a/Artigos/Tabela_Descritiva_Microciclo.docx
+++ b/Artigos/Tabela_Descritiva_Microciclo.docx
@@ -23,20 +23,22 @@
         <w:tblLook w:firstColumn="1" w:firstRow="1" w:lastColumn="0" w:lastRow="0" w:noHBand="0" w:noVBand="1" w:val="04A0"/>
       </w:tblPr>
       <w:tblGrid>
-        <w:gridCol w:w="960"/>
-        <w:gridCol w:w="960"/>
-        <w:gridCol w:w="960"/>
-        <w:gridCol w:w="960"/>
-        <w:gridCol w:w="960"/>
-        <w:gridCol w:w="960"/>
-        <w:gridCol w:w="960"/>
-        <w:gridCol w:w="960"/>
-        <w:gridCol w:w="960"/>
+        <w:gridCol w:w="785"/>
+        <w:gridCol w:w="785"/>
+        <w:gridCol w:w="785"/>
+        <w:gridCol w:w="785"/>
+        <w:gridCol w:w="785"/>
+        <w:gridCol w:w="785"/>
+        <w:gridCol w:w="785"/>
+        <w:gridCol w:w="785"/>
+        <w:gridCol w:w="785"/>
+        <w:gridCol w:w="785"/>
+        <w:gridCol w:w="785"/>
       </w:tblGrid>
       <w:tr>
         <w:tc>
           <w:tcPr>
-            <w:tcW w:type="dxa" w:w="960"/>
+            <w:tcW w:type="dxa" w:w="785"/>
           </w:tcPr>
           <w:p>
             <w:pPr>
@@ -47,7 +49,7 @@
               <w:rPr>
                 <w:rFonts w:ascii="Times New Roman" w:hAnsi="Times New Roman"/>
                 <w:b/>
-                <w:sz w:val="19"/>
+                <w:sz w:val="18"/>
               </w:rPr>
               <w:t>Dia</w:t>
             </w:r>
@@ -55,7 +57,7 @@
         </w:tc>
         <w:tc>
           <w:tcPr>
-            <w:tcW w:type="dxa" w:w="960"/>
+            <w:tcW w:type="dxa" w:w="785"/>
           </w:tcPr>
           <w:p>
             <w:pPr>
@@ -66,7 +68,7 @@
               <w:rPr>
                 <w:rFonts w:ascii="Times New Roman" w:hAnsi="Times New Roman"/>
                 <w:b/>
-                <w:sz w:val="19"/>
+                <w:sz w:val="18"/>
               </w:rPr>
               <w:t>Data</w:t>
             </w:r>
@@ -74,7 +76,7 @@
         </w:tc>
         <w:tc>
           <w:tcPr>
-            <w:tcW w:type="dxa" w:w="960"/>
+            <w:tcW w:type="dxa" w:w="785"/>
           </w:tcPr>
           <w:p>
             <w:pPr>
@@ -85,7 +87,7 @@
               <w:rPr>
                 <w:rFonts w:ascii="Times New Roman" w:hAnsi="Times New Roman"/>
                 <w:b/>
-                <w:sz w:val="19"/>
+                <w:sz w:val="18"/>
               </w:rPr>
               <w:t>Sessão</w:t>
             </w:r>
@@ -93,7 +95,7 @@
         </w:tc>
         <w:tc>
           <w:tcPr>
-            <w:tcW w:type="dxa" w:w="960"/>
+            <w:tcW w:type="dxa" w:w="785"/>
           </w:tcPr>
           <w:p>
             <w:pPr>
@@ -104,7 +106,7 @@
               <w:rPr>
                 <w:rFonts w:ascii="Times New Roman" w:hAnsi="Times New Roman"/>
                 <w:b/>
-                <w:sz w:val="19"/>
+                <w:sz w:val="18"/>
               </w:rPr>
               <w:t>%FCmáx</w:t>
             </w:r>
@@ -112,7 +114,7 @@
         </w:tc>
         <w:tc>
           <w:tcPr>
-            <w:tcW w:type="dxa" w:w="960"/>
+            <w:tcW w:type="dxa" w:w="785"/>
           </w:tcPr>
           <w:p>
             <w:pPr>
@@ -123,15 +125,15 @@
               <w:rPr>
                 <w:rFonts w:ascii="Times New Roman" w:hAnsi="Times New Roman"/>
                 <w:b/>
-                <w:sz w:val="19"/>
+                <w:sz w:val="18"/>
               </w:rPr>
-              <w:t>TRIMP (u.a.)</w:t>
+              <w:t>TRIMP</w:t>
             </w:r>
           </w:p>
         </w:tc>
         <w:tc>
           <w:tcPr>
-            <w:tcW w:type="dxa" w:w="960"/>
+            <w:tcW w:type="dxa" w:w="785"/>
           </w:tcPr>
           <w:p>
             <w:pPr>
@@ -142,15 +144,15 @@
               <w:rPr>
                 <w:rFonts w:ascii="Times New Roman" w:hAnsi="Times New Roman"/>
                 <w:b/>
-                <w:sz w:val="19"/>
+                <w:sz w:val="18"/>
               </w:rPr>
-              <w:t>PSE (0–10)</w:t>
+              <w:t>PSE</w:t>
             </w:r>
           </w:p>
         </w:tc>
         <w:tc>
           <w:tcPr>
-            <w:tcW w:type="dxa" w:w="960"/>
+            <w:tcW w:type="dxa" w:w="785"/>
           </w:tcPr>
           <w:p>
             <w:pPr>
@@ -161,15 +163,15 @@
               <w:rPr>
                 <w:rFonts w:ascii="Times New Roman" w:hAnsi="Times New Roman"/>
                 <w:b/>
-                <w:sz w:val="19"/>
+                <w:sz w:val="18"/>
               </w:rPr>
-              <w:t>sPSE (u.a.)</w:t>
+              <w:t>sPSE</w:t>
             </w:r>
           </w:p>
         </w:tc>
         <w:tc>
           <w:tcPr>
-            <w:tcW w:type="dxa" w:w="960"/>
+            <w:tcW w:type="dxa" w:w="785"/>
           </w:tcPr>
           <w:p>
             <w:pPr>
@@ -180,15 +182,15 @@
               <w:rPr>
                 <w:rFonts w:ascii="Times New Roman" w:hAnsi="Times New Roman"/>
                 <w:b/>
-                <w:sz w:val="19"/>
+                <w:sz w:val="18"/>
               </w:rPr>
-              <w:t>Perfil predominante</w:t>
+              <w:t>Fad. física (0–10)</w:t>
             </w:r>
           </w:p>
         </w:tc>
         <w:tc>
           <w:tcPr>
-            <w:tcW w:type="dxa" w:w="960"/>
+            <w:tcW w:type="dxa" w:w="785"/>
           </w:tcPr>
           <w:p>
             <w:pPr>
@@ -199,7 +201,45 @@
               <w:rPr>
                 <w:rFonts w:ascii="Times New Roman" w:hAnsi="Times New Roman"/>
                 <w:b/>
-                <w:sz w:val="19"/>
+                <w:sz w:val="18"/>
+              </w:rPr>
+              <w:t>TQR (6–20)</w:t>
+            </w:r>
+          </w:p>
+        </w:tc>
+        <w:tc>
+          <w:tcPr>
+            <w:tcW w:type="dxa" w:w="785"/>
+          </w:tcPr>
+          <w:p>
+            <w:pPr>
+              <w:jc w:val="center"/>
+            </w:pPr>
+            <w:r/>
+            <w:r>
+              <w:rPr>
+                <w:rFonts w:ascii="Times New Roman" w:hAnsi="Times New Roman"/>
+                <w:b/>
+                <w:sz w:val="18"/>
+              </w:rPr>
+              <w:t>Perfil predominante</w:t>
+            </w:r>
+          </w:p>
+        </w:tc>
+        <w:tc>
+          <w:tcPr>
+            <w:tcW w:type="dxa" w:w="785"/>
+          </w:tcPr>
+          <w:p>
+            <w:pPr>
+              <w:jc w:val="center"/>
+            </w:pPr>
+            <w:r/>
+            <w:r>
+              <w:rPr>
+                <w:rFonts w:ascii="Times New Roman" w:hAnsi="Times New Roman"/>
+                <w:b/>
+                <w:sz w:val="18"/>
               </w:rPr>
               <w:t>Iceberg (%)</w:t>
             </w:r>
@@ -209,7 +249,7 @@
       <w:tr>
         <w:tc>
           <w:tcPr>
-            <w:tcW w:type="dxa" w:w="960"/>
+            <w:tcW w:type="dxa" w:w="785"/>
           </w:tcPr>
           <w:p>
             <w:pPr>
@@ -220,7 +260,7 @@
               <w:rPr>
                 <w:rFonts w:ascii="Times New Roman" w:hAnsi="Times New Roman"/>
                 <w:b w:val="0"/>
-                <w:sz w:val="19"/>
+                <w:sz w:val="18"/>
               </w:rPr>
               <w:t>D1</w:t>
             </w:r>
@@ -228,7 +268,7 @@
         </w:tc>
         <w:tc>
           <w:tcPr>
-            <w:tcW w:type="dxa" w:w="960"/>
+            <w:tcW w:type="dxa" w:w="785"/>
           </w:tcPr>
           <w:p>
             <w:pPr>
@@ -239,7 +279,7 @@
               <w:rPr>
                 <w:rFonts w:ascii="Times New Roman" w:hAnsi="Times New Roman"/>
                 <w:b w:val="0"/>
-                <w:sz w:val="19"/>
+                <w:sz w:val="18"/>
               </w:rPr>
               <w:t>21/04</w:t>
             </w:r>
@@ -247,7 +287,7 @@
         </w:tc>
         <w:tc>
           <w:tcPr>
-            <w:tcW w:type="dxa" w:w="960"/>
+            <w:tcW w:type="dxa" w:w="785"/>
           </w:tcPr>
           <w:p>
             <w:pPr>
@@ -258,7 +298,7 @@
               <w:rPr>
                 <w:rFonts w:ascii="Times New Roman" w:hAnsi="Times New Roman"/>
                 <w:b w:val="0"/>
-                <w:sz w:val="19"/>
+                <w:sz w:val="18"/>
               </w:rPr>
               <w:t>Técnico-tática</w:t>
             </w:r>
@@ -266,7 +306,7 @@
         </w:tc>
         <w:tc>
           <w:tcPr>
-            <w:tcW w:type="dxa" w:w="960"/>
+            <w:tcW w:type="dxa" w:w="785"/>
           </w:tcPr>
           <w:p>
             <w:pPr>
@@ -277,7 +317,7 @@
               <w:rPr>
                 <w:rFonts w:ascii="Times New Roman" w:hAnsi="Times New Roman"/>
                 <w:b w:val="0"/>
-                <w:sz w:val="19"/>
+                <w:sz w:val="18"/>
               </w:rPr>
               <w:t>—</w:t>
             </w:r>
@@ -285,7 +325,7 @@
         </w:tc>
         <w:tc>
           <w:tcPr>
-            <w:tcW w:type="dxa" w:w="960"/>
+            <w:tcW w:type="dxa" w:w="785"/>
           </w:tcPr>
           <w:p>
             <w:pPr>
@@ -296,7 +336,7 @@
               <w:rPr>
                 <w:rFonts w:ascii="Times New Roman" w:hAnsi="Times New Roman"/>
                 <w:b w:val="0"/>
-                <w:sz w:val="19"/>
+                <w:sz w:val="18"/>
               </w:rPr>
               <w:t>—</w:t>
             </w:r>
@@ -304,7 +344,7 @@
         </w:tc>
         <w:tc>
           <w:tcPr>
-            <w:tcW w:type="dxa" w:w="960"/>
+            <w:tcW w:type="dxa" w:w="785"/>
           </w:tcPr>
           <w:p>
             <w:pPr>
@@ -315,7 +355,7 @@
               <w:rPr>
                 <w:rFonts w:ascii="Times New Roman" w:hAnsi="Times New Roman"/>
                 <w:b w:val="0"/>
-                <w:sz w:val="19"/>
+                <w:sz w:val="18"/>
               </w:rPr>
               <w:t>—</w:t>
             </w:r>
@@ -323,7 +363,7 @@
         </w:tc>
         <w:tc>
           <w:tcPr>
-            <w:tcW w:type="dxa" w:w="960"/>
+            <w:tcW w:type="dxa" w:w="785"/>
           </w:tcPr>
           <w:p>
             <w:pPr>
@@ -334,7 +374,7 @@
               <w:rPr>
                 <w:rFonts w:ascii="Times New Roman" w:hAnsi="Times New Roman"/>
                 <w:b w:val="0"/>
-                <w:sz w:val="19"/>
+                <w:sz w:val="18"/>
               </w:rPr>
               <w:t>—</w:t>
             </w:r>
@@ -342,7 +382,45 @@
         </w:tc>
         <w:tc>
           <w:tcPr>
-            <w:tcW w:type="dxa" w:w="960"/>
+            <w:tcW w:type="dxa" w:w="785"/>
+          </w:tcPr>
+          <w:p>
+            <w:pPr>
+              <w:jc w:val="center"/>
+            </w:pPr>
+            <w:r/>
+            <w:r>
+              <w:rPr>
+                <w:rFonts w:ascii="Times New Roman" w:hAnsi="Times New Roman"/>
+                <w:b w:val="0"/>
+                <w:sz w:val="18"/>
+              </w:rPr>
+              <w:t>4,7</w:t>
+            </w:r>
+          </w:p>
+        </w:tc>
+        <w:tc>
+          <w:tcPr>
+            <w:tcW w:type="dxa" w:w="785"/>
+          </w:tcPr>
+          <w:p>
+            <w:pPr>
+              <w:jc w:val="center"/>
+            </w:pPr>
+            <w:r/>
+            <w:r>
+              <w:rPr>
+                <w:rFonts w:ascii="Times New Roman" w:hAnsi="Times New Roman"/>
+                <w:b w:val="0"/>
+                <w:sz w:val="18"/>
+              </w:rPr>
+              <w:t>13,5</w:t>
+            </w:r>
+          </w:p>
+        </w:tc>
+        <w:tc>
+          <w:tcPr>
+            <w:tcW w:type="dxa" w:w="785"/>
           </w:tcPr>
           <w:p>
             <w:pPr>
@@ -353,7 +431,7 @@
               <w:rPr>
                 <w:rFonts w:ascii="Times New Roman" w:hAnsi="Times New Roman"/>
                 <w:b w:val="0"/>
-                <w:sz w:val="19"/>
+                <w:sz w:val="18"/>
               </w:rPr>
               <w:t>Iceberg</w:t>
             </w:r>
@@ -361,7 +439,7 @@
         </w:tc>
         <w:tc>
           <w:tcPr>
-            <w:tcW w:type="dxa" w:w="960"/>
+            <w:tcW w:type="dxa" w:w="785"/>
           </w:tcPr>
           <w:p>
             <w:pPr>
@@ -372,7 +450,7 @@
               <w:rPr>
                 <w:rFonts w:ascii="Times New Roman" w:hAnsi="Times New Roman"/>
                 <w:b w:val="0"/>
-                <w:sz w:val="19"/>
+                <w:sz w:val="18"/>
               </w:rPr>
               <w:t>41</w:t>
             </w:r>
@@ -382,7 +460,7 @@
       <w:tr>
         <w:tc>
           <w:tcPr>
-            <w:tcW w:type="dxa" w:w="960"/>
+            <w:tcW w:type="dxa" w:w="785"/>
           </w:tcPr>
           <w:p>
             <w:pPr>
@@ -393,7 +471,7 @@
               <w:rPr>
                 <w:rFonts w:ascii="Times New Roman" w:hAnsi="Times New Roman"/>
                 <w:b w:val="0"/>
-                <w:sz w:val="19"/>
+                <w:sz w:val="18"/>
               </w:rPr>
               <w:t>D2</w:t>
             </w:r>
@@ -401,7 +479,7 @@
         </w:tc>
         <w:tc>
           <w:tcPr>
-            <w:tcW w:type="dxa" w:w="960"/>
+            <w:tcW w:type="dxa" w:w="785"/>
           </w:tcPr>
           <w:p>
             <w:pPr>
@@ -412,7 +490,7 @@
               <w:rPr>
                 <w:rFonts w:ascii="Times New Roman" w:hAnsi="Times New Roman"/>
                 <w:b w:val="0"/>
-                <w:sz w:val="19"/>
+                <w:sz w:val="18"/>
               </w:rPr>
               <w:t>22/04</w:t>
             </w:r>
@@ -420,7 +498,7 @@
         </w:tc>
         <w:tc>
           <w:tcPr>
-            <w:tcW w:type="dxa" w:w="960"/>
+            <w:tcW w:type="dxa" w:w="785"/>
           </w:tcPr>
           <w:p>
             <w:pPr>
@@ -431,7 +509,7 @@
               <w:rPr>
                 <w:rFonts w:ascii="Times New Roman" w:hAnsi="Times New Roman"/>
                 <w:b w:val="0"/>
-                <w:sz w:val="19"/>
+                <w:sz w:val="18"/>
               </w:rPr>
               <w:t>HIIT (TIAI)</w:t>
             </w:r>
@@ -439,7 +517,7 @@
         </w:tc>
         <w:tc>
           <w:tcPr>
-            <w:tcW w:type="dxa" w:w="960"/>
+            <w:tcW w:type="dxa" w:w="785"/>
           </w:tcPr>
           <w:p>
             <w:pPr>
@@ -450,7 +528,7 @@
               <w:rPr>
                 <w:rFonts w:ascii="Times New Roman" w:hAnsi="Times New Roman"/>
                 <w:b w:val="0"/>
-                <w:sz w:val="19"/>
+                <w:sz w:val="18"/>
               </w:rPr>
               <w:t>79,5</w:t>
             </w:r>
@@ -458,7 +536,7 @@
         </w:tc>
         <w:tc>
           <w:tcPr>
-            <w:tcW w:type="dxa" w:w="960"/>
+            <w:tcW w:type="dxa" w:w="785"/>
           </w:tcPr>
           <w:p>
             <w:pPr>
@@ -469,7 +547,7 @@
               <w:rPr>
                 <w:rFonts w:ascii="Times New Roman" w:hAnsi="Times New Roman"/>
                 <w:b w:val="0"/>
-                <w:sz w:val="19"/>
+                <w:sz w:val="18"/>
               </w:rPr>
               <w:t>84,0</w:t>
             </w:r>
@@ -477,7 +555,7 @@
         </w:tc>
         <w:tc>
           <w:tcPr>
-            <w:tcW w:type="dxa" w:w="960"/>
+            <w:tcW w:type="dxa" w:w="785"/>
           </w:tcPr>
           <w:p>
             <w:pPr>
@@ -488,7 +566,7 @@
               <w:rPr>
                 <w:rFonts w:ascii="Times New Roman" w:hAnsi="Times New Roman"/>
                 <w:b w:val="0"/>
-                <w:sz w:val="19"/>
+                <w:sz w:val="18"/>
               </w:rPr>
               <w:t>8,3</w:t>
             </w:r>
@@ -496,7 +574,7 @@
         </w:tc>
         <w:tc>
           <w:tcPr>
-            <w:tcW w:type="dxa" w:w="960"/>
+            <w:tcW w:type="dxa" w:w="785"/>
           </w:tcPr>
           <w:p>
             <w:pPr>
@@ -507,7 +585,7 @@
               <w:rPr>
                 <w:rFonts w:ascii="Times New Roman" w:hAnsi="Times New Roman"/>
                 <w:b w:val="0"/>
-                <w:sz w:val="19"/>
+                <w:sz w:val="18"/>
               </w:rPr>
               <w:t>201,7</w:t>
             </w:r>
@@ -515,7 +593,45 @@
         </w:tc>
         <w:tc>
           <w:tcPr>
-            <w:tcW w:type="dxa" w:w="960"/>
+            <w:tcW w:type="dxa" w:w="785"/>
+          </w:tcPr>
+          <w:p>
+            <w:pPr>
+              <w:jc w:val="center"/>
+            </w:pPr>
+            <w:r/>
+            <w:r>
+              <w:rPr>
+                <w:rFonts w:ascii="Times New Roman" w:hAnsi="Times New Roman"/>
+                <w:b w:val="0"/>
+                <w:sz w:val="18"/>
+              </w:rPr>
+              <w:t>6,0</w:t>
+            </w:r>
+          </w:p>
+        </w:tc>
+        <w:tc>
+          <w:tcPr>
+            <w:tcW w:type="dxa" w:w="785"/>
+          </w:tcPr>
+          <w:p>
+            <w:pPr>
+              <w:jc w:val="center"/>
+            </w:pPr>
+            <w:r/>
+            <w:r>
+              <w:rPr>
+                <w:rFonts w:ascii="Times New Roman" w:hAnsi="Times New Roman"/>
+                <w:b w:val="0"/>
+                <w:sz w:val="18"/>
+              </w:rPr>
+              <w:t>11,4</w:t>
+            </w:r>
+          </w:p>
+        </w:tc>
+        <w:tc>
+          <w:tcPr>
+            <w:tcW w:type="dxa" w:w="785"/>
           </w:tcPr>
           <w:p>
             <w:pPr>
@@ -526,7 +642,7 @@
               <w:rPr>
                 <w:rFonts w:ascii="Times New Roman" w:hAnsi="Times New Roman"/>
                 <w:b w:val="0"/>
-                <w:sz w:val="19"/>
+                <w:sz w:val="18"/>
               </w:rPr>
               <w:t>Superfície</w:t>
             </w:r>
@@ -534,7 +650,7 @@
         </w:tc>
         <w:tc>
           <w:tcPr>
-            <w:tcW w:type="dxa" w:w="960"/>
+            <w:tcW w:type="dxa" w:w="785"/>
           </w:tcPr>
           <w:p>
             <w:pPr>
@@ -545,7 +661,7 @@
               <w:rPr>
                 <w:rFonts w:ascii="Times New Roman" w:hAnsi="Times New Roman"/>
                 <w:b w:val="0"/>
-                <w:sz w:val="19"/>
+                <w:sz w:val="18"/>
               </w:rPr>
               <w:t>27</w:t>
             </w:r>
@@ -555,7 +671,7 @@
       <w:tr>
         <w:tc>
           <w:tcPr>
-            <w:tcW w:type="dxa" w:w="960"/>
+            <w:tcW w:type="dxa" w:w="785"/>
           </w:tcPr>
           <w:p>
             <w:pPr>
@@ -566,7 +682,7 @@
               <w:rPr>
                 <w:rFonts w:ascii="Times New Roman" w:hAnsi="Times New Roman"/>
                 <w:b w:val="0"/>
-                <w:sz w:val="19"/>
+                <w:sz w:val="18"/>
               </w:rPr>
               <w:t>D3</w:t>
             </w:r>
@@ -574,7 +690,7 @@
         </w:tc>
         <w:tc>
           <w:tcPr>
-            <w:tcW w:type="dxa" w:w="960"/>
+            <w:tcW w:type="dxa" w:w="785"/>
           </w:tcPr>
           <w:p>
             <w:pPr>
@@ -585,7 +701,7 @@
               <w:rPr>
                 <w:rFonts w:ascii="Times New Roman" w:hAnsi="Times New Roman"/>
                 <w:b w:val="0"/>
-                <w:sz w:val="19"/>
+                <w:sz w:val="18"/>
               </w:rPr>
               <w:t>23/04</w:t>
             </w:r>
@@ -593,7 +709,7 @@
         </w:tc>
         <w:tc>
           <w:tcPr>
-            <w:tcW w:type="dxa" w:w="960"/>
+            <w:tcW w:type="dxa" w:w="785"/>
           </w:tcPr>
           <w:p>
             <w:pPr>
@@ -604,7 +720,7 @@
               <w:rPr>
                 <w:rFonts w:ascii="Times New Roman" w:hAnsi="Times New Roman"/>
                 <w:b w:val="0"/>
-                <w:sz w:val="19"/>
+                <w:sz w:val="18"/>
               </w:rPr>
               <w:t>Técnico-tática</w:t>
             </w:r>
@@ -612,7 +728,7 @@
         </w:tc>
         <w:tc>
           <w:tcPr>
-            <w:tcW w:type="dxa" w:w="960"/>
+            <w:tcW w:type="dxa" w:w="785"/>
           </w:tcPr>
           <w:p>
             <w:pPr>
@@ -623,7 +739,7 @@
               <w:rPr>
                 <w:rFonts w:ascii="Times New Roman" w:hAnsi="Times New Roman"/>
                 <w:b w:val="0"/>
-                <w:sz w:val="19"/>
+                <w:sz w:val="18"/>
               </w:rPr>
               <w:t>—</w:t>
             </w:r>
@@ -631,7 +747,7 @@
         </w:tc>
         <w:tc>
           <w:tcPr>
-            <w:tcW w:type="dxa" w:w="960"/>
+            <w:tcW w:type="dxa" w:w="785"/>
           </w:tcPr>
           <w:p>
             <w:pPr>
@@ -642,7 +758,7 @@
               <w:rPr>
                 <w:rFonts w:ascii="Times New Roman" w:hAnsi="Times New Roman"/>
                 <w:b w:val="0"/>
-                <w:sz w:val="19"/>
+                <w:sz w:val="18"/>
               </w:rPr>
               <w:t>—</w:t>
             </w:r>
@@ -650,7 +766,7 @@
         </w:tc>
         <w:tc>
           <w:tcPr>
-            <w:tcW w:type="dxa" w:w="960"/>
+            <w:tcW w:type="dxa" w:w="785"/>
           </w:tcPr>
           <w:p>
             <w:pPr>
@@ -661,7 +777,7 @@
               <w:rPr>
                 <w:rFonts w:ascii="Times New Roman" w:hAnsi="Times New Roman"/>
                 <w:b w:val="0"/>
-                <w:sz w:val="19"/>
+                <w:sz w:val="18"/>
               </w:rPr>
               <w:t>—</w:t>
             </w:r>
@@ -669,7 +785,7 @@
         </w:tc>
         <w:tc>
           <w:tcPr>
-            <w:tcW w:type="dxa" w:w="960"/>
+            <w:tcW w:type="dxa" w:w="785"/>
           </w:tcPr>
           <w:p>
             <w:pPr>
@@ -680,7 +796,7 @@
               <w:rPr>
                 <w:rFonts w:ascii="Times New Roman" w:hAnsi="Times New Roman"/>
                 <w:b w:val="0"/>
-                <w:sz w:val="19"/>
+                <w:sz w:val="18"/>
               </w:rPr>
               <w:t>—</w:t>
             </w:r>
@@ -688,7 +804,45 @@
         </w:tc>
         <w:tc>
           <w:tcPr>
-            <w:tcW w:type="dxa" w:w="960"/>
+            <w:tcW w:type="dxa" w:w="785"/>
+          </w:tcPr>
+          <w:p>
+            <w:pPr>
+              <w:jc w:val="center"/>
+            </w:pPr>
+            <w:r/>
+            <w:r>
+              <w:rPr>
+                <w:rFonts w:ascii="Times New Roman" w:hAnsi="Times New Roman"/>
+                <w:b w:val="0"/>
+                <w:sz w:val="18"/>
+              </w:rPr>
+              <w:t>6,4</w:t>
+            </w:r>
+          </w:p>
+        </w:tc>
+        <w:tc>
+          <w:tcPr>
+            <w:tcW w:type="dxa" w:w="785"/>
+          </w:tcPr>
+          <w:p>
+            <w:pPr>
+              <w:jc w:val="center"/>
+            </w:pPr>
+            <w:r/>
+            <w:r>
+              <w:rPr>
+                <w:rFonts w:ascii="Times New Roman" w:hAnsi="Times New Roman"/>
+                <w:b w:val="0"/>
+                <w:sz w:val="18"/>
+              </w:rPr>
+              <w:t>11,4</w:t>
+            </w:r>
+          </w:p>
+        </w:tc>
+        <w:tc>
+          <w:tcPr>
+            <w:tcW w:type="dxa" w:w="785"/>
           </w:tcPr>
           <w:p>
             <w:pPr>
@@ -699,7 +853,7 @@
               <w:rPr>
                 <w:rFonts w:ascii="Times New Roman" w:hAnsi="Times New Roman"/>
                 <w:b w:val="0"/>
-                <w:sz w:val="19"/>
+                <w:sz w:val="18"/>
               </w:rPr>
               <w:t>Iceberg</w:t>
             </w:r>
@@ -707,7 +861,7 @@
         </w:tc>
         <w:tc>
           <w:tcPr>
-            <w:tcW w:type="dxa" w:w="960"/>
+            <w:tcW w:type="dxa" w:w="785"/>
           </w:tcPr>
           <w:p>
             <w:pPr>
@@ -718,7 +872,7 @@
               <w:rPr>
                 <w:rFonts w:ascii="Times New Roman" w:hAnsi="Times New Roman"/>
                 <w:b w:val="0"/>
-                <w:sz w:val="19"/>
+                <w:sz w:val="18"/>
               </w:rPr>
               <w:t>38</w:t>
             </w:r>
@@ -728,7 +882,7 @@
       <w:tr>
         <w:tc>
           <w:tcPr>
-            <w:tcW w:type="dxa" w:w="960"/>
+            <w:tcW w:type="dxa" w:w="785"/>
           </w:tcPr>
           <w:p>
             <w:pPr>
@@ -739,7 +893,7 @@
               <w:rPr>
                 <w:rFonts w:ascii="Times New Roman" w:hAnsi="Times New Roman"/>
                 <w:b w:val="0"/>
-                <w:sz w:val="19"/>
+                <w:sz w:val="18"/>
               </w:rPr>
               <w:t>D4</w:t>
             </w:r>
@@ -747,7 +901,7 @@
         </w:tc>
         <w:tc>
           <w:tcPr>
-            <w:tcW w:type="dxa" w:w="960"/>
+            <w:tcW w:type="dxa" w:w="785"/>
           </w:tcPr>
           <w:p>
             <w:pPr>
@@ -758,7 +912,7 @@
               <w:rPr>
                 <w:rFonts w:ascii="Times New Roman" w:hAnsi="Times New Roman"/>
                 <w:b w:val="0"/>
-                <w:sz w:val="19"/>
+                <w:sz w:val="18"/>
               </w:rPr>
               <w:t>24/04</w:t>
             </w:r>
@@ -766,7 +920,7 @@
         </w:tc>
         <w:tc>
           <w:tcPr>
-            <w:tcW w:type="dxa" w:w="960"/>
+            <w:tcW w:type="dxa" w:w="785"/>
           </w:tcPr>
           <w:p>
             <w:pPr>
@@ -777,7 +931,7 @@
               <w:rPr>
                 <w:rFonts w:ascii="Times New Roman" w:hAnsi="Times New Roman"/>
                 <w:b w:val="0"/>
-                <w:sz w:val="19"/>
+                <w:sz w:val="18"/>
               </w:rPr>
               <w:t>HIIT (TIAI)</w:t>
             </w:r>
@@ -785,7 +939,7 @@
         </w:tc>
         <w:tc>
           <w:tcPr>
-            <w:tcW w:type="dxa" w:w="960"/>
+            <w:tcW w:type="dxa" w:w="785"/>
           </w:tcPr>
           <w:p>
             <w:pPr>
@@ -796,7 +950,7 @@
               <w:rPr>
                 <w:rFonts w:ascii="Times New Roman" w:hAnsi="Times New Roman"/>
                 <w:b w:val="0"/>
-                <w:sz w:val="19"/>
+                <w:sz w:val="18"/>
               </w:rPr>
               <w:t>77,6</w:t>
             </w:r>
@@ -804,7 +958,7 @@
         </w:tc>
         <w:tc>
           <w:tcPr>
-            <w:tcW w:type="dxa" w:w="960"/>
+            <w:tcW w:type="dxa" w:w="785"/>
           </w:tcPr>
           <w:p>
             <w:pPr>
@@ -815,7 +969,7 @@
               <w:rPr>
                 <w:rFonts w:ascii="Times New Roman" w:hAnsi="Times New Roman"/>
                 <w:b w:val="0"/>
-                <w:sz w:val="19"/>
+                <w:sz w:val="18"/>
               </w:rPr>
               <w:t>79,6</w:t>
             </w:r>
@@ -823,7 +977,7 @@
         </w:tc>
         <w:tc>
           <w:tcPr>
-            <w:tcW w:type="dxa" w:w="960"/>
+            <w:tcW w:type="dxa" w:w="785"/>
           </w:tcPr>
           <w:p>
             <w:pPr>
@@ -834,7 +988,7 @@
               <w:rPr>
                 <w:rFonts w:ascii="Times New Roman" w:hAnsi="Times New Roman"/>
                 <w:b w:val="0"/>
-                <w:sz w:val="19"/>
+                <w:sz w:val="18"/>
               </w:rPr>
               <w:t>8,5</w:t>
             </w:r>
@@ -842,7 +996,7 @@
         </w:tc>
         <w:tc>
           <w:tcPr>
-            <w:tcW w:type="dxa" w:w="960"/>
+            <w:tcW w:type="dxa" w:w="785"/>
           </w:tcPr>
           <w:p>
             <w:pPr>
@@ -853,7 +1007,7 @@
               <w:rPr>
                 <w:rFonts w:ascii="Times New Roman" w:hAnsi="Times New Roman"/>
                 <w:b w:val="0"/>
-                <w:sz w:val="19"/>
+                <w:sz w:val="18"/>
               </w:rPr>
               <w:t>205,7</w:t>
             </w:r>
@@ -861,7 +1015,45 @@
         </w:tc>
         <w:tc>
           <w:tcPr>
-            <w:tcW w:type="dxa" w:w="960"/>
+            <w:tcW w:type="dxa" w:w="785"/>
+          </w:tcPr>
+          <w:p>
+            <w:pPr>
+              <w:jc w:val="center"/>
+            </w:pPr>
+            <w:r/>
+            <w:r>
+              <w:rPr>
+                <w:rFonts w:ascii="Times New Roman" w:hAnsi="Times New Roman"/>
+                <w:b w:val="0"/>
+                <w:sz w:val="18"/>
+              </w:rPr>
+              <w:t>7,1</w:t>
+            </w:r>
+          </w:p>
+        </w:tc>
+        <w:tc>
+          <w:tcPr>
+            <w:tcW w:type="dxa" w:w="785"/>
+          </w:tcPr>
+          <w:p>
+            <w:pPr>
+              <w:jc w:val="center"/>
+            </w:pPr>
+            <w:r/>
+            <w:r>
+              <w:rPr>
+                <w:rFonts w:ascii="Times New Roman" w:hAnsi="Times New Roman"/>
+                <w:b w:val="0"/>
+                <w:sz w:val="18"/>
+              </w:rPr>
+              <w:t>11,1</w:t>
+            </w:r>
+          </w:p>
+        </w:tc>
+        <w:tc>
+          <w:tcPr>
+            <w:tcW w:type="dxa" w:w="785"/>
           </w:tcPr>
           <w:p>
             <w:pPr>
@@ -872,7 +1064,7 @@
               <w:rPr>
                 <w:rFonts w:ascii="Times New Roman" w:hAnsi="Times New Roman"/>
                 <w:b w:val="0"/>
-                <w:sz w:val="19"/>
+                <w:sz w:val="18"/>
               </w:rPr>
               <w:t>Iceberg</w:t>
             </w:r>
@@ -880,7 +1072,7 @@
         </w:tc>
         <w:tc>
           <w:tcPr>
-            <w:tcW w:type="dxa" w:w="960"/>
+            <w:tcW w:type="dxa" w:w="785"/>
           </w:tcPr>
           <w:p>
             <w:pPr>
@@ -891,7 +1083,7 @@
               <w:rPr>
                 <w:rFonts w:ascii="Times New Roman" w:hAnsi="Times New Roman"/>
                 <w:b w:val="0"/>
-                <w:sz w:val="19"/>
+                <w:sz w:val="18"/>
               </w:rPr>
               <w:t>33</w:t>
             </w:r>
@@ -901,7 +1093,7 @@
       <w:tr>
         <w:tc>
           <w:tcPr>
-            <w:tcW w:type="dxa" w:w="960"/>
+            <w:tcW w:type="dxa" w:w="785"/>
           </w:tcPr>
           <w:p>
             <w:pPr>
@@ -912,7 +1104,7 @@
               <w:rPr>
                 <w:rFonts w:ascii="Times New Roman" w:hAnsi="Times New Roman"/>
                 <w:b w:val="0"/>
-                <w:sz w:val="19"/>
+                <w:sz w:val="18"/>
               </w:rPr>
               <w:t>D5</w:t>
             </w:r>
@@ -920,7 +1112,7 @@
         </w:tc>
         <w:tc>
           <w:tcPr>
-            <w:tcW w:type="dxa" w:w="960"/>
+            <w:tcW w:type="dxa" w:w="785"/>
           </w:tcPr>
           <w:p>
             <w:pPr>
@@ -931,7 +1123,7 @@
               <w:rPr>
                 <w:rFonts w:ascii="Times New Roman" w:hAnsi="Times New Roman"/>
                 <w:b w:val="0"/>
-                <w:sz w:val="19"/>
+                <w:sz w:val="18"/>
               </w:rPr>
               <w:t>25/04</w:t>
             </w:r>
@@ -939,7 +1131,7 @@
         </w:tc>
         <w:tc>
           <w:tcPr>
-            <w:tcW w:type="dxa" w:w="960"/>
+            <w:tcW w:type="dxa" w:w="785"/>
           </w:tcPr>
           <w:p>
             <w:pPr>
@@ -950,7 +1142,7 @@
               <w:rPr>
                 <w:rFonts w:ascii="Times New Roman" w:hAnsi="Times New Roman"/>
                 <w:b w:val="0"/>
-                <w:sz w:val="19"/>
+                <w:sz w:val="18"/>
               </w:rPr>
               <w:t>Técnico-tática</w:t>
             </w:r>
@@ -958,7 +1150,7 @@
         </w:tc>
         <w:tc>
           <w:tcPr>
-            <w:tcW w:type="dxa" w:w="960"/>
+            <w:tcW w:type="dxa" w:w="785"/>
           </w:tcPr>
           <w:p>
             <w:pPr>
@@ -969,7 +1161,7 @@
               <w:rPr>
                 <w:rFonts w:ascii="Times New Roman" w:hAnsi="Times New Roman"/>
                 <w:b w:val="0"/>
-                <w:sz w:val="19"/>
+                <w:sz w:val="18"/>
               </w:rPr>
               <w:t>—</w:t>
             </w:r>
@@ -977,7 +1169,7 @@
         </w:tc>
         <w:tc>
           <w:tcPr>
-            <w:tcW w:type="dxa" w:w="960"/>
+            <w:tcW w:type="dxa" w:w="785"/>
           </w:tcPr>
           <w:p>
             <w:pPr>
@@ -988,7 +1180,7 @@
               <w:rPr>
                 <w:rFonts w:ascii="Times New Roman" w:hAnsi="Times New Roman"/>
                 <w:b w:val="0"/>
-                <w:sz w:val="19"/>
+                <w:sz w:val="18"/>
               </w:rPr>
               <w:t>—</w:t>
             </w:r>
@@ -996,7 +1188,7 @@
         </w:tc>
         <w:tc>
           <w:tcPr>
-            <w:tcW w:type="dxa" w:w="960"/>
+            <w:tcW w:type="dxa" w:w="785"/>
           </w:tcPr>
           <w:p>
             <w:pPr>
@@ -1007,7 +1199,7 @@
               <w:rPr>
                 <w:rFonts w:ascii="Times New Roman" w:hAnsi="Times New Roman"/>
                 <w:b w:val="0"/>
-                <w:sz w:val="19"/>
+                <w:sz w:val="18"/>
               </w:rPr>
               <w:t>—</w:t>
             </w:r>
@@ -1015,7 +1207,7 @@
         </w:tc>
         <w:tc>
           <w:tcPr>
-            <w:tcW w:type="dxa" w:w="960"/>
+            <w:tcW w:type="dxa" w:w="785"/>
           </w:tcPr>
           <w:p>
             <w:pPr>
@@ -1026,7 +1218,7 @@
               <w:rPr>
                 <w:rFonts w:ascii="Times New Roman" w:hAnsi="Times New Roman"/>
                 <w:b w:val="0"/>
-                <w:sz w:val="19"/>
+                <w:sz w:val="18"/>
               </w:rPr>
               <w:t>—</w:t>
             </w:r>
@@ -1034,7 +1226,45 @@
         </w:tc>
         <w:tc>
           <w:tcPr>
-            <w:tcW w:type="dxa" w:w="960"/>
+            <w:tcW w:type="dxa" w:w="785"/>
+          </w:tcPr>
+          <w:p>
+            <w:pPr>
+              <w:jc w:val="center"/>
+            </w:pPr>
+            <w:r/>
+            <w:r>
+              <w:rPr>
+                <w:rFonts w:ascii="Times New Roman" w:hAnsi="Times New Roman"/>
+                <w:b w:val="0"/>
+                <w:sz w:val="18"/>
+              </w:rPr>
+              <w:t>6,0</w:t>
+            </w:r>
+          </w:p>
+        </w:tc>
+        <w:tc>
+          <w:tcPr>
+            <w:tcW w:type="dxa" w:w="785"/>
+          </w:tcPr>
+          <w:p>
+            <w:pPr>
+              <w:jc w:val="center"/>
+            </w:pPr>
+            <w:r/>
+            <w:r>
+              <w:rPr>
+                <w:rFonts w:ascii="Times New Roman" w:hAnsi="Times New Roman"/>
+                <w:b w:val="0"/>
+                <w:sz w:val="18"/>
+              </w:rPr>
+              <w:t>11,6</w:t>
+            </w:r>
+          </w:p>
+        </w:tc>
+        <w:tc>
+          <w:tcPr>
+            <w:tcW w:type="dxa" w:w="785"/>
           </w:tcPr>
           <w:p>
             <w:pPr>
@@ -1045,7 +1275,7 @@
               <w:rPr>
                 <w:rFonts w:ascii="Times New Roman" w:hAnsi="Times New Roman"/>
                 <w:b w:val="0"/>
-                <w:sz w:val="19"/>
+                <w:sz w:val="18"/>
               </w:rPr>
               <w:t>Iceberg</w:t>
             </w:r>
@@ -1053,7 +1283,7 @@
         </w:tc>
         <w:tc>
           <w:tcPr>
-            <w:tcW w:type="dxa" w:w="960"/>
+            <w:tcW w:type="dxa" w:w="785"/>
           </w:tcPr>
           <w:p>
             <w:pPr>
@@ -1064,7 +1294,7 @@
               <w:rPr>
                 <w:rFonts w:ascii="Times New Roman" w:hAnsi="Times New Roman"/>
                 <w:b w:val="0"/>
-                <w:sz w:val="19"/>
+                <w:sz w:val="18"/>
               </w:rPr>
               <w:t>35</w:t>
             </w:r>
@@ -1074,7 +1304,7 @@
       <w:tr>
         <w:tc>
           <w:tcPr>
-            <w:tcW w:type="dxa" w:w="960"/>
+            <w:tcW w:type="dxa" w:w="785"/>
           </w:tcPr>
           <w:p>
             <w:pPr>
@@ -1085,7 +1315,7 @@
               <w:rPr>
                 <w:rFonts w:ascii="Times New Roman" w:hAnsi="Times New Roman"/>
                 <w:b w:val="0"/>
-                <w:sz w:val="19"/>
+                <w:sz w:val="18"/>
               </w:rPr>
               <w:t>D6</w:t>
             </w:r>
@@ -1093,7 +1323,7 @@
         </w:tc>
         <w:tc>
           <w:tcPr>
-            <w:tcW w:type="dxa" w:w="960"/>
+            <w:tcW w:type="dxa" w:w="785"/>
           </w:tcPr>
           <w:p>
             <w:pPr>
@@ -1104,7 +1334,7 @@
               <w:rPr>
                 <w:rFonts w:ascii="Times New Roman" w:hAnsi="Times New Roman"/>
                 <w:b w:val="0"/>
-                <w:sz w:val="19"/>
+                <w:sz w:val="18"/>
               </w:rPr>
               <w:t>26/04</w:t>
             </w:r>
@@ -1112,7 +1342,7 @@
         </w:tc>
         <w:tc>
           <w:tcPr>
-            <w:tcW w:type="dxa" w:w="960"/>
+            <w:tcW w:type="dxa" w:w="785"/>
           </w:tcPr>
           <w:p>
             <w:pPr>
@@ -1123,7 +1353,7 @@
               <w:rPr>
                 <w:rFonts w:ascii="Times New Roman" w:hAnsi="Times New Roman"/>
                 <w:b w:val="0"/>
-                <w:sz w:val="19"/>
+                <w:sz w:val="18"/>
               </w:rPr>
               <w:t>Técnico-tática</w:t>
             </w:r>
@@ -1131,7 +1361,7 @@
         </w:tc>
         <w:tc>
           <w:tcPr>
-            <w:tcW w:type="dxa" w:w="960"/>
+            <w:tcW w:type="dxa" w:w="785"/>
           </w:tcPr>
           <w:p>
             <w:pPr>
@@ -1142,7 +1372,7 @@
               <w:rPr>
                 <w:rFonts w:ascii="Times New Roman" w:hAnsi="Times New Roman"/>
                 <w:b w:val="0"/>
-                <w:sz w:val="19"/>
+                <w:sz w:val="18"/>
               </w:rPr>
               <w:t>—</w:t>
             </w:r>
@@ -1150,7 +1380,7 @@
         </w:tc>
         <w:tc>
           <w:tcPr>
-            <w:tcW w:type="dxa" w:w="960"/>
+            <w:tcW w:type="dxa" w:w="785"/>
           </w:tcPr>
           <w:p>
             <w:pPr>
@@ -1161,7 +1391,7 @@
               <w:rPr>
                 <w:rFonts w:ascii="Times New Roman" w:hAnsi="Times New Roman"/>
                 <w:b w:val="0"/>
-                <w:sz w:val="19"/>
+                <w:sz w:val="18"/>
               </w:rPr>
               <w:t>—</w:t>
             </w:r>
@@ -1169,7 +1399,7 @@
         </w:tc>
         <w:tc>
           <w:tcPr>
-            <w:tcW w:type="dxa" w:w="960"/>
+            <w:tcW w:type="dxa" w:w="785"/>
           </w:tcPr>
           <w:p>
             <w:pPr>
@@ -1180,7 +1410,7 @@
               <w:rPr>
                 <w:rFonts w:ascii="Times New Roman" w:hAnsi="Times New Roman"/>
                 <w:b w:val="0"/>
-                <w:sz w:val="19"/>
+                <w:sz w:val="18"/>
               </w:rPr>
               <w:t>—</w:t>
             </w:r>
@@ -1188,7 +1418,7 @@
         </w:tc>
         <w:tc>
           <w:tcPr>
-            <w:tcW w:type="dxa" w:w="960"/>
+            <w:tcW w:type="dxa" w:w="785"/>
           </w:tcPr>
           <w:p>
             <w:pPr>
@@ -1199,7 +1429,7 @@
               <w:rPr>
                 <w:rFonts w:ascii="Times New Roman" w:hAnsi="Times New Roman"/>
                 <w:b w:val="0"/>
-                <w:sz w:val="19"/>
+                <w:sz w:val="18"/>
               </w:rPr>
               <w:t>—</w:t>
             </w:r>
@@ -1207,7 +1437,45 @@
         </w:tc>
         <w:tc>
           <w:tcPr>
-            <w:tcW w:type="dxa" w:w="960"/>
+            <w:tcW w:type="dxa" w:w="785"/>
+          </w:tcPr>
+          <w:p>
+            <w:pPr>
+              <w:jc w:val="center"/>
+            </w:pPr>
+            <w:r/>
+            <w:r>
+              <w:rPr>
+                <w:rFonts w:ascii="Times New Roman" w:hAnsi="Times New Roman"/>
+                <w:b w:val="0"/>
+                <w:sz w:val="18"/>
+              </w:rPr>
+              <w:t>6,4</w:t>
+            </w:r>
+          </w:p>
+        </w:tc>
+        <w:tc>
+          <w:tcPr>
+            <w:tcW w:type="dxa" w:w="785"/>
+          </w:tcPr>
+          <w:p>
+            <w:pPr>
+              <w:jc w:val="center"/>
+            </w:pPr>
+            <w:r/>
+            <w:r>
+              <w:rPr>
+                <w:rFonts w:ascii="Times New Roman" w:hAnsi="Times New Roman"/>
+                <w:b w:val="0"/>
+                <w:sz w:val="18"/>
+              </w:rPr>
+              <w:t>11,7</w:t>
+            </w:r>
+          </w:p>
+        </w:tc>
+        <w:tc>
+          <w:tcPr>
+            <w:tcW w:type="dxa" w:w="785"/>
           </w:tcPr>
           <w:p>
             <w:pPr>
@@ -1218,7 +1486,7 @@
               <w:rPr>
                 <w:rFonts w:ascii="Times New Roman" w:hAnsi="Times New Roman"/>
                 <w:b w:val="0"/>
-                <w:sz w:val="19"/>
+                <w:sz w:val="18"/>
               </w:rPr>
               <w:t>Superfície</w:t>
             </w:r>
@@ -1226,7 +1494,7 @@
         </w:tc>
         <w:tc>
           <w:tcPr>
-            <w:tcW w:type="dxa" w:w="960"/>
+            <w:tcW w:type="dxa" w:w="785"/>
           </w:tcPr>
           <w:p>
             <w:pPr>
@@ -1237,7 +1505,7 @@
               <w:rPr>
                 <w:rFonts w:ascii="Times New Roman" w:hAnsi="Times New Roman"/>
                 <w:b w:val="0"/>
-                <w:sz w:val="19"/>
+                <w:sz w:val="18"/>
               </w:rPr>
               <w:t>27</w:t>
             </w:r>
@@ -1247,7 +1515,7 @@
       <w:tr>
         <w:tc>
           <w:tcPr>
-            <w:tcW w:type="dxa" w:w="960"/>
+            <w:tcW w:type="dxa" w:w="785"/>
           </w:tcPr>
           <w:p>
             <w:pPr>
@@ -1258,7 +1526,7 @@
               <w:rPr>
                 <w:rFonts w:ascii="Times New Roman" w:hAnsi="Times New Roman"/>
                 <w:b w:val="0"/>
-                <w:sz w:val="19"/>
+                <w:sz w:val="18"/>
               </w:rPr>
               <w:t>D7</w:t>
             </w:r>
@@ -1266,7 +1534,7 @@
         </w:tc>
         <w:tc>
           <w:tcPr>
-            <w:tcW w:type="dxa" w:w="960"/>
+            <w:tcW w:type="dxa" w:w="785"/>
           </w:tcPr>
           <w:p>
             <w:pPr>
@@ -1277,7 +1545,7 @@
               <w:rPr>
                 <w:rFonts w:ascii="Times New Roman" w:hAnsi="Times New Roman"/>
                 <w:b w:val="0"/>
-                <w:sz w:val="19"/>
+                <w:sz w:val="18"/>
               </w:rPr>
               <w:t>27/04</w:t>
             </w:r>
@@ -1285,7 +1553,7 @@
         </w:tc>
         <w:tc>
           <w:tcPr>
-            <w:tcW w:type="dxa" w:w="960"/>
+            <w:tcW w:type="dxa" w:w="785"/>
           </w:tcPr>
           <w:p>
             <w:pPr>
@@ -1296,7 +1564,7 @@
               <w:rPr>
                 <w:rFonts w:ascii="Times New Roman" w:hAnsi="Times New Roman"/>
                 <w:b w:val="0"/>
-                <w:sz w:val="19"/>
+                <w:sz w:val="18"/>
               </w:rPr>
               <w:t>HIIT (TIAI)</w:t>
             </w:r>
@@ -1304,7 +1572,7 @@
         </w:tc>
         <w:tc>
           <w:tcPr>
-            <w:tcW w:type="dxa" w:w="960"/>
+            <w:tcW w:type="dxa" w:w="785"/>
           </w:tcPr>
           <w:p>
             <w:pPr>
@@ -1315,7 +1583,7 @@
               <w:rPr>
                 <w:rFonts w:ascii="Times New Roman" w:hAnsi="Times New Roman"/>
                 <w:b w:val="0"/>
-                <w:sz w:val="19"/>
+                <w:sz w:val="18"/>
               </w:rPr>
               <w:t>75,7</w:t>
             </w:r>
@@ -1323,7 +1591,7 @@
         </w:tc>
         <w:tc>
           <w:tcPr>
-            <w:tcW w:type="dxa" w:w="960"/>
+            <w:tcW w:type="dxa" w:w="785"/>
           </w:tcPr>
           <w:p>
             <w:pPr>
@@ -1334,7 +1602,7 @@
               <w:rPr>
                 <w:rFonts w:ascii="Times New Roman" w:hAnsi="Times New Roman"/>
                 <w:b w:val="0"/>
-                <w:sz w:val="19"/>
+                <w:sz w:val="18"/>
               </w:rPr>
               <w:t>75,2</w:t>
             </w:r>
@@ -1342,7 +1610,7 @@
         </w:tc>
         <w:tc>
           <w:tcPr>
-            <w:tcW w:type="dxa" w:w="960"/>
+            <w:tcW w:type="dxa" w:w="785"/>
           </w:tcPr>
           <w:p>
             <w:pPr>
@@ -1353,7 +1621,7 @@
               <w:rPr>
                 <w:rFonts w:ascii="Times New Roman" w:hAnsi="Times New Roman"/>
                 <w:b w:val="0"/>
-                <w:sz w:val="19"/>
+                <w:sz w:val="18"/>
               </w:rPr>
               <w:t>8,9</w:t>
             </w:r>
@@ -1361,7 +1629,7 @@
         </w:tc>
         <w:tc>
           <w:tcPr>
-            <w:tcW w:type="dxa" w:w="960"/>
+            <w:tcW w:type="dxa" w:w="785"/>
           </w:tcPr>
           <w:p>
             <w:pPr>
@@ -1372,7 +1640,7 @@
               <w:rPr>
                 <w:rFonts w:ascii="Times New Roman" w:hAnsi="Times New Roman"/>
                 <w:b w:val="0"/>
-                <w:sz w:val="19"/>
+                <w:sz w:val="18"/>
               </w:rPr>
               <w:t>215,8</w:t>
             </w:r>
@@ -1380,7 +1648,45 @@
         </w:tc>
         <w:tc>
           <w:tcPr>
-            <w:tcW w:type="dxa" w:w="960"/>
+            <w:tcW w:type="dxa" w:w="785"/>
+          </w:tcPr>
+          <w:p>
+            <w:pPr>
+              <w:jc w:val="center"/>
+            </w:pPr>
+            <w:r/>
+            <w:r>
+              <w:rPr>
+                <w:rFonts w:ascii="Times New Roman" w:hAnsi="Times New Roman"/>
+                <w:b w:val="0"/>
+                <w:sz w:val="18"/>
+              </w:rPr>
+              <w:t>7,6</w:t>
+            </w:r>
+          </w:p>
+        </w:tc>
+        <w:tc>
+          <w:tcPr>
+            <w:tcW w:type="dxa" w:w="785"/>
+          </w:tcPr>
+          <w:p>
+            <w:pPr>
+              <w:jc w:val="center"/>
+            </w:pPr>
+            <w:r/>
+            <w:r>
+              <w:rPr>
+                <w:rFonts w:ascii="Times New Roman" w:hAnsi="Times New Roman"/>
+                <w:b w:val="0"/>
+                <w:sz w:val="18"/>
+              </w:rPr>
+              <w:t>9,0</w:t>
+            </w:r>
+          </w:p>
+        </w:tc>
+        <w:tc>
+          <w:tcPr>
+            <w:tcW w:type="dxa" w:w="785"/>
           </w:tcPr>
           <w:p>
             <w:pPr>
@@ -1391,7 +1697,7 @@
               <w:rPr>
                 <w:rFonts w:ascii="Times New Roman" w:hAnsi="Times New Roman"/>
                 <w:b w:val="0"/>
-                <w:sz w:val="19"/>
+                <w:sz w:val="18"/>
               </w:rPr>
               <w:t>Superfície</w:t>
             </w:r>
@@ -1399,7 +1705,7 @@
         </w:tc>
         <w:tc>
           <w:tcPr>
-            <w:tcW w:type="dxa" w:w="960"/>
+            <w:tcW w:type="dxa" w:w="785"/>
           </w:tcPr>
           <w:p>
             <w:pPr>
@@ -1410,7 +1716,7 @@
               <w:rPr>
                 <w:rFonts w:ascii="Times New Roman" w:hAnsi="Times New Roman"/>
                 <w:b w:val="0"/>
-                <w:sz w:val="19"/>
+                <w:sz w:val="18"/>
               </w:rPr>
               <w:t>10</w:t>
             </w:r>
@@ -1428,7 +1734,7 @@
           <w:i/>
           <w:sz w:val="18"/>
         </w:rPr>
-        <w:t>HIIT (TIAI): treinamento intervalado de alta intensidade. %FCmáx: percentual da frequência cardíaca máxima; TRIMP: impulso de treino (Banister); PSE: percepção subjetiva de esforço da sessão (0–10); sPSE: PSE da sessão × duração (u.a.). Sessões de HIIT em D2, D4 e D7. A carga interna foi quantificada apenas nas sessões de HIIT; nos dias técnico-táticos (—) não houve monitoramento fisiológico. Perfil predominante: perfil de humor mais frequente entre os atletas no dia, classificado nos seis perfis de Terry/Parsons-Smith a partir das seis dimensões do BRUMS. Iceberg (%): proporção de atletas com perfil iceberg no dia. Note a assinatura de fadiga acumulada nas sessões de HIIT: o %FCmáx e o TRIMP declinam (84,0 → 75,2) enquanto a PSE aumenta (8,3 → 8,9).</w:t>
+        <w:t>HIIT (TIAI): treinamento intervalado de alta intensidade (D2, D4 e D7). Carga interna da sessão (só quantificada no HIIT): %FCmáx (percentual da frequência cardíaca máxima), TRIMP (impulso de treino de Banister), PSE (percepção de esforço da sessão, 0–10) e sPSE (PSE × duração, u.a.); nos dias técnico-táticos (—) não houve monitoramento fisiológico da sessão. Carga percebida/recuperação (registrada em todos os dias): Fad. física (fadiga física percebida, 0–10) e TQR (qualidade total de recuperação, 6–20; valores mais altos = mais recuperado). Perfil predominante: perfil de humor mais frequente no dia, classificado nos seis perfis de Terry/Parsons-Smith a partir das seis dimensões do BRUMS; Iceberg (%): proporção de atletas em perfil iceberg. Nas sessões de HIIT, o %FCmáx e o TRIMP declinam (84,0 → 75,2) enquanto a PSE aumenta (8,3 → 8,9); em paralelo, a fadiga física percebida sobe (4,7 → 7,6) e a recuperação cai (TQR 13,5 → 9,0) ao longo da semana.</w:t>
       </w:r>
     </w:p>
     <w:p>

</xml_diff>

<commit_message>
Table script: D1 = baseline (no training), D2 = first training session
Mirrors the dashboard baseline correction in the microcycle characterization
table and its caption note.

Co-Authored-By: Claude Opus 4.8 <noreply@anthropic.com>
Claude-Session: https://claude.ai/code/session_01P7yGiDeoGDyjWvPWQVsUrj
</commit_message>
<xml_diff>
--- a/Artigos/Tabela_Descritiva_Microciclo.docx
+++ b/Artigos/Tabela_Descritiva_Microciclo.docx
@@ -300,7 +300,7 @@
                 <w:b w:val="0"/>
                 <w:sz w:val="18"/>
               </w:rPr>
-              <w:t>Técnico-tática</w:t>
+              <w:t>Baseline (sem treino)</w:t>
             </w:r>
           </w:p>
         </w:tc>
@@ -1734,7 +1734,7 @@
           <w:i/>
           <w:sz w:val="18"/>
         </w:rPr>
-        <w:t>HIIT (TIAI): treinamento intervalado de alta intensidade (D2, D4 e D7). Carga interna da sessão (só quantificada no HIIT): %FCmáx (percentual da frequência cardíaca máxima), TRIMP (impulso de treino de Banister), PSE (percepção de esforço da sessão, 0–10) e sPSE (PSE × duração, u.a.); nos dias técnico-táticos (—) não houve monitoramento fisiológico da sessão. Carga percebida/recuperação (registrada em todos os dias): Fad. física (fadiga física percebida, 0–10) e TQR (qualidade total de recuperação, 6–20; valores mais altos = mais recuperado). Perfil predominante: perfil de humor mais frequente no dia, classificado nos seis perfis de Terry/Parsons-Smith a partir das seis dimensões do BRUMS; Iceberg (%): proporção de atletas em perfil iceberg. Nas sessões de HIIT, o %FCmáx e o TRIMP declinam (84,0 → 75,2) enquanto a PSE aumenta (8,3 → 8,9); em paralelo, a fadiga física percebida sobe (4,7 → 7,6) e a recuperação cai (TQR 13,5 → 9,0) ao longo da semana.</w:t>
+        <w:t>D1 (21/04): dia de baseline, sem treino — medida de referência do humor antes do início do microciclo; D2 (22/04) foi a primeira sessão de treino. HIIT (TIAI): treinamento intervalado de alta intensidade (D2, D4 e D7). Carga interna da sessão (só quantificada no HIIT): %FCmáx (percentual da frequência cardíaca máxima), TRIMP (impulso de treino de Banister), PSE (percepção de esforço da sessão, 0–10) e sPSE (PSE × duração, u.a.); nos dias técnico-táticos (—) não houve monitoramento fisiológico da sessão. Carga percebida/recuperação (registrada em todos os dias): Fad. física (fadiga física percebida, 0–10) e TQR (qualidade total de recuperação, 6–20; valores mais altos = mais recuperado). Perfil predominante: perfil de humor mais frequente no dia, classificado nos seis perfis de Terry/Parsons-Smith a partir das seis dimensões do BRUMS; Iceberg (%): proporção de atletas em perfil iceberg. Nas sessões de HIIT, o %FCmáx e o TRIMP declinam (84,0 → 75,2) enquanto a PSE aumenta (8,3 → 8,9); em paralelo, a fadiga física percebida sobe (4,7 → 7,6) e a recuperação cai (TQR 13,5 → 9,0) ao longo da semana.</w:t>
       </w:r>
     </w:p>
     <w:p>

</xml_diff>

<commit_message>
Table script: D1 = technical-tactical + BRUMS baseline; note the mixed microcycle
Co-Authored-By: Claude Opus 4.8 <noreply@anthropic.com>
Claude-Session: https://claude.ai/code/session_01P7yGiDeoGDyjWvPWQVsUrj
</commit_message>
<xml_diff>
--- a/Artigos/Tabela_Descritiva_Microciclo.docx
+++ b/Artigos/Tabela_Descritiva_Microciclo.docx
@@ -300,7 +300,7 @@
                 <w:b w:val="0"/>
                 <w:sz w:val="18"/>
               </w:rPr>
-              <w:t>Baseline (sem treino)</w:t>
+              <w:t>Técnico-tática (baseline)</w:t>
             </w:r>
           </w:p>
         </w:tc>
@@ -1734,7 +1734,7 @@
           <w:i/>
           <w:sz w:val="18"/>
         </w:rPr>
-        <w:t>D1 (21/04): dia de baseline, sem treino — medida de referência do humor antes do início do microciclo; D2 (22/04) foi a primeira sessão de treino. HIIT (TIAI): treinamento intervalado de alta intensidade (D2, D4 e D7). Carga interna da sessão (só quantificada no HIIT): %FCmáx (percentual da frequência cardíaca máxima), TRIMP (impulso de treino de Banister), PSE (percepção de esforço da sessão, 0–10) e sPSE (PSE × duração, u.a.); nos dias técnico-táticos (—) não houve monitoramento fisiológico da sessão. Carga percebida/recuperação (registrada em todos os dias): Fad. física (fadiga física percebida, 0–10) e TQR (qualidade total de recuperação, 6–20; valores mais altos = mais recuperado). Perfil predominante: perfil de humor mais frequente no dia, classificado nos seis perfis de Terry/Parsons-Smith a partir das seis dimensões do BRUMS; Iceberg (%): proporção de atletas em perfil iceberg. Nas sessões de HIIT, o %FCmáx e o TRIMP declinam (84,0 → 75,2) enquanto a PSE aumenta (8,3 → 8,9); em paralelo, a fadiga física percebida sobe (4,7 → 7,6) e a recuperação cai (TQR 13,5 → 9,0) ao longo da semana.</w:t>
+        <w:t>D1 (21/04): serviu de baseline do BRUMS (medida de referência do humor), com uma sessão técnico-tática à noite. O microciclo é misto: além do HIIT, inclui sessões de força e amistosos; o pico de volume ocorre em D5–D6 (ver a tabela de estrutura de treino sessão a sessão). HIIT (TIAI): treinamento intervalado de alta intensidade (D2, D4 e D7). Carga interna da sessão (só quantificada no HIIT): %FCmáx (percentual da frequência cardíaca máxima), TRIMP (impulso de treino de Banister), PSE (percepção de esforço da sessão, 0–10) e sPSE (PSE × duração, u.a.); nos dias técnico-táticos (—) não houve monitoramento fisiológico da sessão. Carga percebida/recuperação (registrada em todos os dias): Fad. física (fadiga física percebida, 0–10) e TQR (qualidade total de recuperação, 6–20; valores mais altos = mais recuperado). Perfil predominante: perfil de humor mais frequente no dia, classificado nos seis perfis de Terry/Parsons-Smith a partir das seis dimensões do BRUMS; Iceberg (%): proporção de atletas em perfil iceberg. Nas sessões de HIIT, o %FCmáx e o TRIMP declinam (84,0 → 75,2) enquanto a PSE aumenta (8,3 → 8,9); em paralelo, a fadiga física percebida sobe (4,7 → 7,6) e a recuperação cai (TQR 13,5 → 9,0) ao longo da semana.</w:t>
       </w:r>
     </w:p>
     <w:p>

</xml_diff>